<commit_message>
consolidate loops over subjects
put DMD and reconstruction in same loop
simplify dstnc variable
</commit_message>
<xml_diff>
--- a/Reports/26-August-2024.docx
+++ b/Reports/26-August-2024.docx
@@ -2971,6 +2971,633 @@
     </w:p>
     <w:p>
       <w:pPr>
+        <w:pStyle w:val="MDPI23heading3"/>
+      </w:pPr>
+      <w:r>
+        <w:t>2.4.3</w:t>
+      </w:r>
+      <w:r>
+        <w:t xml:space="preserve">. </w:t>
+      </w:r>
+      <w:r>
+        <w:t>Comparison of standard vs. exact DMD modes</w:t>
+      </w:r>
+    </w:p>
+    <w:p>
+      <w:pPr>
+        <w:pStyle w:val="MDPI31text"/>
+      </w:pPr>
+      <w:r>
+        <w:t xml:space="preserve">Tu </w:t>
+      </w:r>
+      <w:r>
+        <w:rPr>
+          <w:i/>
+          <w:iCs/>
+        </w:rPr>
+        <w:t>et</w:t>
+      </w:r>
+      <w:r>
+        <w:t xml:space="preserve">. </w:t>
+      </w:r>
+      <w:r>
+        <w:rPr>
+          <w:i/>
+          <w:iCs/>
+        </w:rPr>
+        <w:t>al</w:t>
+      </w:r>
+      <w:r>
+        <w:t xml:space="preserve">. </w:t>
+      </w:r>
+      <w:proofErr w:type="gramStart"/>
+      <w:r>
+        <w:t>go</w:t>
+      </w:r>
+      <w:proofErr w:type="gramEnd"/>
+      <w:r>
+        <w:t xml:space="preserve"> to some pains to explain that standard DMD and exact DMD modes are identical up to a projection.  Taking exact DMD modes </w:t>
+      </w:r>
+      <m:oMath>
+        <m:r>
+          <m:rPr>
+            <m:sty m:val="bi"/>
+          </m:rPr>
+          <w:rPr>
+            <w:rFonts w:ascii="Cambria Math" w:hAnsi="Cambria Math"/>
+          </w:rPr>
+          <m:t>φ</m:t>
+        </m:r>
+      </m:oMath>
+      <w:r>
+        <w:t xml:space="preserve"> as the “true” modes, standard DMD </w:t>
+      </w:r>
+      <w:proofErr w:type="spellStart"/>
+      <w:r>
+        <w:t>modes</w:t>
+      </w:r>
+      <w:proofErr w:type="spellEnd"/>
+      <w:r>
+        <w:t xml:space="preserve"> </w:t>
+      </w:r>
+      <m:oMath>
+        <m:acc>
+          <m:accPr>
+            <m:ctrlPr>
+              <w:rPr>
+                <w:rFonts w:ascii="Cambria Math" w:hAnsi="Cambria Math"/>
+                <w:b/>
+                <w:bCs/>
+                <w:i/>
+              </w:rPr>
+            </m:ctrlPr>
+          </m:accPr>
+          <m:e>
+            <m:r>
+              <m:rPr>
+                <m:sty m:val="bi"/>
+              </m:rPr>
+              <w:rPr>
+                <w:rFonts w:ascii="Cambria Math" w:hAnsi="Cambria Math"/>
+              </w:rPr>
+              <m:t>φ</m:t>
+            </m:r>
+          </m:e>
+        </m:acc>
+      </m:oMath>
+      <w:r>
+        <w:t xml:space="preserve"> must satisfy the relation </w:t>
+      </w:r>
+      <m:oMath>
+        <m:acc>
+          <m:accPr>
+            <m:ctrlPr>
+              <w:rPr>
+                <w:rFonts w:ascii="Cambria Math" w:hAnsi="Cambria Math"/>
+                <w:b/>
+                <w:bCs/>
+                <w:i/>
+              </w:rPr>
+            </m:ctrlPr>
+          </m:accPr>
+          <m:e>
+            <m:r>
+              <m:rPr>
+                <m:sty m:val="bi"/>
+              </m:rPr>
+              <w:rPr>
+                <w:rFonts w:ascii="Cambria Math" w:hAnsi="Cambria Math"/>
+              </w:rPr>
+              <m:t>φ</m:t>
+            </m:r>
+          </m:e>
+        </m:acc>
+        <m:r>
+          <w:rPr>
+            <w:rFonts w:ascii="Cambria Math" w:hAnsi="Cambria Math"/>
+          </w:rPr>
+          <m:t>=</m:t>
+        </m:r>
+        <m:sSub>
+          <m:sSubPr>
+            <m:ctrlPr>
+              <w:rPr>
+                <w:rFonts w:ascii="Cambria Math" w:hAnsi="Cambria Math"/>
+                <w:i/>
+              </w:rPr>
+            </m:ctrlPr>
+          </m:sSubPr>
+          <m:e>
+            <m:r>
+              <m:rPr>
+                <m:scr m:val="double-struck"/>
+              </m:rPr>
+              <w:rPr>
+                <w:rFonts w:ascii="Cambria Math" w:hAnsi="Cambria Math"/>
+              </w:rPr>
+              <m:t>P</m:t>
+            </m:r>
+          </m:e>
+          <m:sub>
+            <m:r>
+              <w:rPr>
+                <w:rFonts w:ascii="Cambria Math" w:hAnsi="Cambria Math"/>
+              </w:rPr>
+              <m:t>X</m:t>
+            </m:r>
+          </m:sub>
+        </m:sSub>
+        <m:r>
+          <m:rPr>
+            <m:sty m:val="bi"/>
+          </m:rPr>
+          <w:rPr>
+            <w:rFonts w:ascii="Cambria Math" w:hAnsi="Cambria Math"/>
+          </w:rPr>
+          <m:t>φ</m:t>
+        </m:r>
+      </m:oMath>
+      <w:r>
+        <w:t xml:space="preserve">, with </w:t>
+      </w:r>
+      <m:oMath>
+        <m:sSub>
+          <m:sSubPr>
+            <m:ctrlPr>
+              <w:rPr>
+                <w:rFonts w:ascii="Cambria Math" w:hAnsi="Cambria Math"/>
+                <w:i/>
+              </w:rPr>
+            </m:ctrlPr>
+          </m:sSubPr>
+          <m:e>
+            <m:r>
+              <m:rPr>
+                <m:scr m:val="double-struck"/>
+              </m:rPr>
+              <w:rPr>
+                <w:rFonts w:ascii="Cambria Math" w:hAnsi="Cambria Math"/>
+              </w:rPr>
+              <m:t>P</m:t>
+            </m:r>
+          </m:e>
+          <m:sub>
+            <m:r>
+              <w:rPr>
+                <w:rFonts w:ascii="Cambria Math" w:hAnsi="Cambria Math"/>
+              </w:rPr>
+              <m:t>X</m:t>
+            </m:r>
+          </m:sub>
+        </m:sSub>
+      </m:oMath>
+      <w:r>
+        <w:t xml:space="preserve"> representing the orthogonal projection onto the image of the input matrix </w:t>
+      </w:r>
+      <m:oMath>
+        <m:r>
+          <m:rPr>
+            <m:sty m:val="bi"/>
+          </m:rPr>
+          <w:rPr>
+            <w:rFonts w:ascii="Cambria Math" w:hAnsi="Cambria Math"/>
+          </w:rPr>
+          <m:t>X</m:t>
+        </m:r>
+      </m:oMath>
+      <w:r>
+        <w:t xml:space="preserve">.  By the same token, the “true” modes </w:t>
+      </w:r>
+      <m:oMath>
+        <m:r>
+          <m:rPr>
+            <m:sty m:val="bi"/>
+          </m:rPr>
+          <w:rPr>
+            <w:rFonts w:ascii="Cambria Math" w:hAnsi="Cambria Math"/>
+          </w:rPr>
+          <m:t>φ</m:t>
+        </m:r>
+      </m:oMath>
+      <w:r>
+        <w:t xml:space="preserve"> lie in the image of the output matrix </w:t>
+      </w:r>
+      <m:oMath>
+        <m:r>
+          <m:rPr>
+            <m:sty m:val="bi"/>
+          </m:rPr>
+          <w:rPr>
+            <w:rFonts w:ascii="Cambria Math" w:hAnsi="Cambria Math"/>
+          </w:rPr>
+          <m:t>Y</m:t>
+        </m:r>
+      </m:oMath>
+      <w:r>
+        <w:t xml:space="preserve">.  In the present case, where </w:t>
+      </w:r>
+      <m:oMath>
+        <m:sSub>
+          <m:sSubPr>
+            <m:ctrlPr>
+              <w:rPr>
+                <w:rFonts w:ascii="Cambria Math" w:hAnsi="Cambria Math"/>
+                <w:i/>
+              </w:rPr>
+            </m:ctrlPr>
+          </m:sSubPr>
+          <m:e>
+            <m:r>
+              <w:rPr>
+                <w:rFonts w:ascii="Cambria Math" w:hAnsi="Cambria Math"/>
+              </w:rPr>
+              <m:t>y</m:t>
+            </m:r>
+          </m:e>
+          <m:sub>
+            <m:r>
+              <w:rPr>
+                <w:rFonts w:ascii="Cambria Math" w:hAnsi="Cambria Math"/>
+              </w:rPr>
+              <m:t>t</m:t>
+            </m:r>
+          </m:sub>
+        </m:sSub>
+        <m:r>
+          <w:rPr>
+            <w:rFonts w:ascii="Cambria Math" w:hAnsi="Cambria Math"/>
+          </w:rPr>
+          <m:t>=</m:t>
+        </m:r>
+        <m:sSub>
+          <m:sSubPr>
+            <m:ctrlPr>
+              <w:rPr>
+                <w:rFonts w:ascii="Cambria Math" w:hAnsi="Cambria Math"/>
+                <w:i/>
+              </w:rPr>
+            </m:ctrlPr>
+          </m:sSubPr>
+          <m:e>
+            <m:r>
+              <w:rPr>
+                <w:rFonts w:ascii="Cambria Math" w:hAnsi="Cambria Math"/>
+              </w:rPr>
+              <m:t>x</m:t>
+            </m:r>
+          </m:e>
+          <m:sub>
+            <m:r>
+              <w:rPr>
+                <w:rFonts w:ascii="Cambria Math" w:hAnsi="Cambria Math"/>
+              </w:rPr>
+              <m:t>t+1</m:t>
+            </m:r>
+          </m:sub>
+        </m:sSub>
+      </m:oMath>
+      <w:r>
+        <w:t xml:space="preserve"> it is probable that these images are similar enough to be visually and computationally indistinguishable.  However, it is likely worth comparing the two to confirm that both methods produce similar results.</w:t>
+      </w:r>
+    </w:p>
+    <w:p>
+      <w:pPr>
+        <w:pStyle w:val="MDPI31text"/>
+      </w:pPr>
+    </w:p>
+    <w:p>
+      <w:pPr>
+        <w:pStyle w:val="MDPI31text"/>
+      </w:pPr>
+    </w:p>
+    <w:p>
+      <w:pPr>
+        <w:pStyle w:val="MDPI22heading2"/>
+      </w:pPr>
+      <w:r>
+        <w:t>2.5.  Group-Level Decomposition</w:t>
+      </w:r>
+    </w:p>
+    <w:p>
+      <w:pPr>
+        <w:pStyle w:val="MDPI31text"/>
+      </w:pPr>
+    </w:p>
+    <w:p>
+      <w:pPr>
+        <w:pStyle w:val="MDPI23heading3"/>
+      </w:pPr>
+      <w:r>
+        <w:t>2.5.</w:t>
+      </w:r>
+      <w:r>
+        <w:t>1</w:t>
+      </w:r>
+      <w:r>
+        <w:t>.</w:t>
+      </w:r>
+      <w:r>
+        <w:t xml:space="preserve"> </w:t>
+      </w:r>
+      <w:r>
+        <w:t xml:space="preserve">Comparison </w:t>
+      </w:r>
+      <w:r>
+        <w:t>of Group-Level Modes</w:t>
+      </w:r>
+    </w:p>
+    <w:p>
+      <w:pPr>
+        <w:pStyle w:val="MDPI31text"/>
+      </w:pPr>
+    </w:p>
+    <w:p>
+      <w:pPr>
+        <w:pStyle w:val="MDPI31text"/>
+      </w:pPr>
+    </w:p>
+    <w:p>
+      <w:pPr>
+        <w:pStyle w:val="MDPI23heading3"/>
+      </w:pPr>
+      <w:r>
+        <w:t>2.5.</w:t>
+      </w:r>
+      <w:r>
+        <w:t>2</w:t>
+      </w:r>
+      <w:r>
+        <w:t>.</w:t>
+      </w:r>
+      <w:r>
+        <w:t xml:space="preserve"> </w:t>
+      </w:r>
+      <w:r>
+        <w:t xml:space="preserve">Comparison </w:t>
+      </w:r>
+      <w:r>
+        <w:t xml:space="preserve">of </w:t>
+      </w:r>
+      <w:r>
+        <w:t xml:space="preserve">Group-Level </w:t>
+      </w:r>
+      <w:r>
+        <w:t>Spectra</w:t>
+      </w:r>
+    </w:p>
+    <w:p>
+      <w:pPr>
+        <w:pStyle w:val="MDPI31text"/>
+      </w:pPr>
+    </w:p>
+    <w:p>
+      <w:pPr>
+        <w:pStyle w:val="MDPI31text"/>
+      </w:pPr>
+    </w:p>
+    <w:p>
+      <w:pPr>
+        <w:pStyle w:val="MDPI22heading2"/>
+      </w:pPr>
+      <w:r>
+        <w:t>2.</w:t>
+      </w:r>
+      <w:r>
+        <w:t>6</w:t>
+      </w:r>
+      <w:r>
+        <w:t xml:space="preserve">. Subject-Level </w:t>
+      </w:r>
+      <w:r>
+        <w:t>Decomposition</w:t>
+      </w:r>
+    </w:p>
+    <w:p>
+      <w:pPr>
+        <w:pStyle w:val="MDPI31text"/>
+      </w:pPr>
+    </w:p>
+    <w:p>
+      <w:pPr>
+        <w:pStyle w:val="MDPI23heading3"/>
+      </w:pPr>
+      <w:r>
+        <w:t>2.</w:t>
+      </w:r>
+      <w:r>
+        <w:t>6</w:t>
+      </w:r>
+      <w:r>
+        <w:t>.1.</w:t>
+      </w:r>
+      <w:r>
+        <w:t xml:space="preserve"> </w:t>
+      </w:r>
+      <w:r>
+        <w:t xml:space="preserve">Comparison of </w:t>
+      </w:r>
+      <w:r>
+        <w:t>Subject</w:t>
+      </w:r>
+      <w:r>
+        <w:t>-Level Modes</w:t>
+      </w:r>
+    </w:p>
+    <w:p>
+      <w:pPr>
+        <w:pStyle w:val="MDPI31text"/>
+      </w:pPr>
+    </w:p>
+    <w:p>
+      <w:pPr>
+        <w:pStyle w:val="MDPI31text"/>
+      </w:pPr>
+    </w:p>
+    <w:p>
+      <w:pPr>
+        <w:pStyle w:val="MDPI23heading3"/>
+      </w:pPr>
+      <w:r>
+        <w:t>2.</w:t>
+      </w:r>
+      <w:r>
+        <w:t>6</w:t>
+      </w:r>
+      <w:r>
+        <w:t>.2.</w:t>
+      </w:r>
+      <w:r>
+        <w:t xml:space="preserve"> </w:t>
+      </w:r>
+      <w:r>
+        <w:t xml:space="preserve">Comparison of </w:t>
+      </w:r>
+      <w:r>
+        <w:t>Subject</w:t>
+      </w:r>
+      <w:r>
+        <w:t>-Level Spectra</w:t>
+      </w:r>
+    </w:p>
+    <w:p>
+      <w:pPr>
+        <w:pStyle w:val="MDPI31text"/>
+      </w:pPr>
+    </w:p>
+    <w:p>
+      <w:pPr>
+        <w:pStyle w:val="MDPI31text"/>
+      </w:pPr>
+    </w:p>
+    <w:p>
+      <w:pPr>
+        <w:pStyle w:val="MDPI23heading3"/>
+      </w:pPr>
+      <w:r>
+        <w:t>2.</w:t>
+      </w:r>
+      <w:r>
+        <w:t>6</w:t>
+      </w:r>
+      <w:r>
+        <w:t>.</w:t>
+      </w:r>
+      <w:r>
+        <w:t>3</w:t>
+      </w:r>
+      <w:r>
+        <w:t>.</w:t>
+      </w:r>
+      <w:r>
+        <w:t xml:space="preserve"> </w:t>
+      </w:r>
+      <w:r>
+        <w:t>Compar</w:t>
+      </w:r>
+      <w:r>
+        <w:t>ing</w:t>
+      </w:r>
+      <w:r>
+        <w:t xml:space="preserve"> Subject</w:t>
+      </w:r>
+      <w:r>
+        <w:t xml:space="preserve"> Modes to Group Modes</w:t>
+      </w:r>
+    </w:p>
+    <w:p>
+      <w:pPr>
+        <w:pStyle w:val="MDPI31text"/>
+      </w:pPr>
+    </w:p>
+    <w:p>
+      <w:pPr>
+        <w:pStyle w:val="MDPI31text"/>
+      </w:pPr>
+    </w:p>
+    <w:p>
+      <w:pPr>
+        <w:pStyle w:val="MDPI23heading3"/>
+      </w:pPr>
+      <w:r>
+        <w:t>2.6.4.</w:t>
+      </w:r>
+      <w:r>
+        <w:t xml:space="preserve"> </w:t>
+      </w:r>
+      <w:r>
+        <w:t xml:space="preserve">Comparing Subject </w:t>
+      </w:r>
+      <w:r>
+        <w:t>Spectra</w:t>
+      </w:r>
+      <w:r>
+        <w:t xml:space="preserve"> to Group </w:t>
+      </w:r>
+      <w:r>
+        <w:t>Spectra</w:t>
+      </w:r>
+    </w:p>
+    <w:p>
+      <w:pPr>
+        <w:pStyle w:val="MDPI31text"/>
+      </w:pPr>
+    </w:p>
+    <w:p>
+      <w:pPr>
+        <w:pStyle w:val="MDPI31text"/>
+      </w:pPr>
+    </w:p>
+    <w:p>
+      <w:pPr>
+        <w:pStyle w:val="MDPI22heading2"/>
+      </w:pPr>
+      <w:r>
+        <w:t>2.</w:t>
+      </w:r>
+      <w:r>
+        <w:t>7</w:t>
+      </w:r>
+      <w:r>
+        <w:t xml:space="preserve">.  </w:t>
+      </w:r>
+      <w:r>
+        <w:t>Independent Mode Decomposition</w:t>
+      </w:r>
+    </w:p>
+    <w:p>
+      <w:pPr>
+        <w:pStyle w:val="MDPI31text"/>
+      </w:pPr>
+    </w:p>
+    <w:p>
+      <w:pPr>
+        <w:pStyle w:val="MDPI23heading3"/>
+      </w:pPr>
+      <w:r>
+        <w:t>2.</w:t>
+      </w:r>
+      <w:r>
+        <w:t>7</w:t>
+      </w:r>
+      <w:r>
+        <w:t>.1.</w:t>
+      </w:r>
+      <w:r>
+        <w:t xml:space="preserve"> </w:t>
+      </w:r>
+    </w:p>
+    <w:p>
+      <w:pPr>
+        <w:pStyle w:val="MDPI31text"/>
+      </w:pPr>
+    </w:p>
+    <w:p>
+      <w:pPr>
+        <w:pStyle w:val="MDPI31text"/>
+      </w:pPr>
+    </w:p>
+    <w:p>
+      <w:pPr>
         <w:pStyle w:val="MDPI31text"/>
         <w:sectPr>
           <w:headerReference w:type="even" r:id="rId10"/>
@@ -4204,380 +4831,10 @@
         <w:t>4</w:t>
       </w:r>
       <w:r>
-        <w:t xml:space="preserve">.1. </w:t>
-      </w:r>
-      <w:r>
-        <w:t>Comparison of standard vs. exact DMD modes</w:t>
-      </w:r>
-    </w:p>
-    <w:p>
-      <w:pPr>
-        <w:pStyle w:val="MDPI31text"/>
-      </w:pPr>
-      <w:r>
-        <w:t xml:space="preserve">Tu </w:t>
-      </w:r>
-      <w:r>
-        <w:rPr>
-          <w:i/>
-          <w:iCs/>
-        </w:rPr>
-        <w:t>et</w:t>
-      </w:r>
-      <w:r>
-        <w:t xml:space="preserve">. </w:t>
-      </w:r>
-      <w:r>
-        <w:rPr>
-          <w:i/>
-          <w:iCs/>
-        </w:rPr>
-        <w:t>al</w:t>
-      </w:r>
-      <w:r>
-        <w:t xml:space="preserve">. </w:t>
-      </w:r>
-      <w:proofErr w:type="gramStart"/>
-      <w:r>
-        <w:t>go</w:t>
-      </w:r>
-      <w:proofErr w:type="gramEnd"/>
-      <w:r>
-        <w:t xml:space="preserve"> to some pains to explain that standard DMD and exact DMD modes are identical up to a projection.  Taking exact DMD modes</w:t>
-      </w:r>
-      <w:r>
-        <w:t xml:space="preserve"> </w:t>
-      </w:r>
-      <m:oMath>
-        <m:r>
-          <m:rPr>
-            <m:sty m:val="bi"/>
-          </m:rPr>
-          <w:rPr>
-            <w:rFonts w:ascii="Cambria Math" w:hAnsi="Cambria Math"/>
-          </w:rPr>
-          <m:t>φ</m:t>
-        </m:r>
-      </m:oMath>
-      <w:r>
-        <w:t xml:space="preserve"> as the “true” modes, standard DMD</w:t>
-      </w:r>
-      <w:r>
-        <w:t xml:space="preserve"> modes </w:t>
-      </w:r>
-      <m:oMath>
-        <m:acc>
-          <m:accPr>
-            <m:ctrlPr>
-              <w:rPr>
-                <w:rFonts w:ascii="Cambria Math" w:hAnsi="Cambria Math"/>
-                <w:b/>
-                <w:bCs/>
-                <w:i/>
-              </w:rPr>
-            </m:ctrlPr>
-          </m:accPr>
-          <m:e>
-            <m:r>
-              <m:rPr>
-                <m:sty m:val="bi"/>
-              </m:rPr>
-              <w:rPr>
-                <w:rFonts w:ascii="Cambria Math" w:hAnsi="Cambria Math"/>
-              </w:rPr>
-              <m:t>φ</m:t>
-            </m:r>
-          </m:e>
-        </m:acc>
-      </m:oMath>
-      <w:r>
-        <w:t xml:space="preserve"> </w:t>
-      </w:r>
-      <w:r>
-        <w:t xml:space="preserve">must satisfy the relation </w:t>
-      </w:r>
-      <m:oMath>
-        <m:acc>
-          <m:accPr>
-            <m:ctrlPr>
-              <w:rPr>
-                <w:rFonts w:ascii="Cambria Math" w:hAnsi="Cambria Math"/>
-                <w:b/>
-                <w:bCs/>
-                <w:i/>
-              </w:rPr>
-            </m:ctrlPr>
-          </m:accPr>
-          <m:e>
-            <m:r>
-              <m:rPr>
-                <m:sty m:val="bi"/>
-              </m:rPr>
-              <w:rPr>
-                <w:rFonts w:ascii="Cambria Math" w:hAnsi="Cambria Math"/>
-              </w:rPr>
-              <m:t>φ</m:t>
-            </m:r>
-          </m:e>
-        </m:acc>
-        <m:r>
-          <w:rPr>
-            <w:rFonts w:ascii="Cambria Math" w:hAnsi="Cambria Math"/>
-          </w:rPr>
-          <m:t>=</m:t>
-        </m:r>
-        <m:sSub>
-          <m:sSubPr>
-            <m:ctrlPr>
-              <w:rPr>
-                <w:rFonts w:ascii="Cambria Math" w:hAnsi="Cambria Math"/>
-                <w:i/>
-              </w:rPr>
-            </m:ctrlPr>
-          </m:sSubPr>
-          <m:e>
-            <m:r>
-              <m:rPr>
-                <m:scr m:val="double-struck"/>
-              </m:rPr>
-              <w:rPr>
-                <w:rFonts w:ascii="Cambria Math" w:hAnsi="Cambria Math"/>
-              </w:rPr>
-              <m:t>P</m:t>
-            </m:r>
-          </m:e>
-          <m:sub>
-            <m:r>
-              <w:rPr>
-                <w:rFonts w:ascii="Cambria Math" w:hAnsi="Cambria Math"/>
-              </w:rPr>
-              <m:t>X</m:t>
-            </m:r>
-          </m:sub>
-        </m:sSub>
-        <m:r>
-          <m:rPr>
-            <m:sty m:val="bi"/>
-          </m:rPr>
-          <w:rPr>
-            <w:rFonts w:ascii="Cambria Math" w:hAnsi="Cambria Math"/>
-          </w:rPr>
-          <m:t>φ</m:t>
-        </m:r>
-      </m:oMath>
-      <w:r>
-        <w:t xml:space="preserve">, with </w:t>
-      </w:r>
-      <m:oMath>
-        <m:sSub>
-          <m:sSubPr>
-            <m:ctrlPr>
-              <w:rPr>
-                <w:rFonts w:ascii="Cambria Math" w:hAnsi="Cambria Math"/>
-                <w:i/>
-              </w:rPr>
-            </m:ctrlPr>
-          </m:sSubPr>
-          <m:e>
-            <m:r>
-              <m:rPr>
-                <m:scr m:val="double-struck"/>
-              </m:rPr>
-              <w:rPr>
-                <w:rFonts w:ascii="Cambria Math" w:hAnsi="Cambria Math"/>
-              </w:rPr>
-              <m:t>P</m:t>
-            </m:r>
-          </m:e>
-          <m:sub>
-            <m:r>
-              <w:rPr>
-                <w:rFonts w:ascii="Cambria Math" w:hAnsi="Cambria Math"/>
-              </w:rPr>
-              <m:t>X</m:t>
-            </m:r>
-          </m:sub>
-        </m:sSub>
-      </m:oMath>
-      <w:r>
-        <w:t xml:space="preserve"> representing the orthogonal projection onto the image of the input matrix </w:t>
-      </w:r>
-      <m:oMath>
-        <m:r>
-          <m:rPr>
-            <m:sty m:val="bi"/>
-          </m:rPr>
-          <w:rPr>
-            <w:rFonts w:ascii="Cambria Math" w:hAnsi="Cambria Math"/>
-          </w:rPr>
-          <m:t>X</m:t>
-        </m:r>
-      </m:oMath>
-      <w:r>
-        <w:t xml:space="preserve">.  By the same token, the “true” modes </w:t>
-      </w:r>
-      <m:oMath>
-        <m:r>
-          <m:rPr>
-            <m:sty m:val="bi"/>
-          </m:rPr>
-          <w:rPr>
-            <w:rFonts w:ascii="Cambria Math" w:hAnsi="Cambria Math"/>
-          </w:rPr>
-          <m:t>φ</m:t>
-        </m:r>
-      </m:oMath>
-      <w:r>
-        <w:t xml:space="preserve"> lie in the image of the output matrix </w:t>
-      </w:r>
-      <m:oMath>
-        <m:r>
-          <m:rPr>
-            <m:sty m:val="bi"/>
-          </m:rPr>
-          <w:rPr>
-            <w:rFonts w:ascii="Cambria Math" w:hAnsi="Cambria Math"/>
-          </w:rPr>
-          <m:t>Y</m:t>
-        </m:r>
-      </m:oMath>
-      <w:r>
         <w:t>.</w:t>
       </w:r>
       <w:r>
-        <w:t xml:space="preserve">  In the present case, where </w:t>
-      </w:r>
-      <m:oMath>
-        <m:sSub>
-          <m:sSubPr>
-            <m:ctrlPr>
-              <w:rPr>
-                <w:rFonts w:ascii="Cambria Math" w:hAnsi="Cambria Math"/>
-                <w:i/>
-              </w:rPr>
-            </m:ctrlPr>
-          </m:sSubPr>
-          <m:e>
-            <m:r>
-              <w:rPr>
-                <w:rFonts w:ascii="Cambria Math" w:hAnsi="Cambria Math"/>
-              </w:rPr>
-              <m:t>y</m:t>
-            </m:r>
-          </m:e>
-          <m:sub>
-            <m:r>
-              <w:rPr>
-                <w:rFonts w:ascii="Cambria Math" w:hAnsi="Cambria Math"/>
-              </w:rPr>
-              <m:t>t</m:t>
-            </m:r>
-          </m:sub>
-        </m:sSub>
-        <m:r>
-          <w:rPr>
-            <w:rFonts w:ascii="Cambria Math" w:hAnsi="Cambria Math"/>
-          </w:rPr>
-          <m:t>=</m:t>
-        </m:r>
-        <m:sSub>
-          <m:sSubPr>
-            <m:ctrlPr>
-              <w:rPr>
-                <w:rFonts w:ascii="Cambria Math" w:hAnsi="Cambria Math"/>
-                <w:i/>
-              </w:rPr>
-            </m:ctrlPr>
-          </m:sSubPr>
-          <m:e>
-            <m:r>
-              <w:rPr>
-                <w:rFonts w:ascii="Cambria Math" w:hAnsi="Cambria Math"/>
-              </w:rPr>
-              <m:t>x</m:t>
-            </m:r>
-          </m:e>
-          <m:sub>
-            <m:r>
-              <w:rPr>
-                <w:rFonts w:ascii="Cambria Math" w:hAnsi="Cambria Math"/>
-              </w:rPr>
-              <m:t>t+1</m:t>
-            </m:r>
-          </m:sub>
-        </m:sSub>
-      </m:oMath>
-      <w:r>
-        <w:t xml:space="preserve"> it is probable that these images are similar enough to be visually and computationally indistinguishable.  However, it is likely worth comparing the two to confirm that both methods produce similar results.</w:t>
-      </w:r>
-    </w:p>
-    <w:p>
-      <w:pPr>
-        <w:pStyle w:val="MDPI31text"/>
-      </w:pPr>
-    </w:p>
-    <w:p>
-      <w:pPr>
-        <w:pStyle w:val="MDPI22heading2"/>
-      </w:pPr>
-      <w:r>
-        <w:t>4</w:t>
-      </w:r>
-      <w:r>
-        <w:t>.</w:t>
-      </w:r>
-      <w:r>
-        <w:t>2</w:t>
-      </w:r>
-      <w:r>
-        <w:t xml:space="preserve">. </w:t>
-      </w:r>
-      <w:r>
-        <w:t>Large-Scale Modes and their Spectra</w:t>
-      </w:r>
-    </w:p>
-    <w:p>
-      <w:pPr>
-        <w:pStyle w:val="MDPI31text"/>
-      </w:pPr>
-      <w:r>
-        <w:t xml:space="preserve">Given the ability to extract modes and spectra from multiple subjects, an obvious next step in the </w:t>
-      </w:r>
-      <w:r>
-        <w:t>analysis is to compare group-level modes and spectra.  If group-level decompositions reveal substantial changes in modes or spectra</w:t>
-      </w:r>
-      <w:r>
-        <w:t>, t</w:t>
-      </w:r>
-      <w:r>
-        <w:t xml:space="preserve">his may show whether the disorders contained in the FBIRN data affect the dynamic evolution of </w:t>
-      </w:r>
-      <w:proofErr w:type="spellStart"/>
-      <w:r>
-        <w:t>dFNC</w:t>
-      </w:r>
-      <w:proofErr w:type="spellEnd"/>
-      <w:r>
-        <w:t>.</w:t>
-      </w:r>
-    </w:p>
-    <w:p>
-      <w:pPr>
-        <w:pStyle w:val="MDPI31text"/>
-      </w:pPr>
-    </w:p>
-    <w:p>
-      <w:pPr>
-        <w:pStyle w:val="MDPI22heading2"/>
-      </w:pPr>
-      <w:r>
-        <w:t>4</w:t>
-      </w:r>
-      <w:r>
-        <w:t>.</w:t>
-      </w:r>
-      <w:r>
-        <w:t>3</w:t>
+        <w:t>1</w:t>
       </w:r>
       <w:r>
         <w:t xml:space="preserve">. </w:t>
@@ -4661,64 +4918,64 @@
         <w:t>.</w:t>
       </w:r>
       <w:r>
+        <w:t>2</w:t>
+      </w:r>
+      <w:r>
+        <w:t xml:space="preserve">. </w:t>
+      </w:r>
+      <w:r>
+        <w:t>Large-Scale Modes and their Spectra</w:t>
+      </w:r>
+    </w:p>
+    <w:p>
+      <w:pPr>
+        <w:pStyle w:val="MDPI31text"/>
+      </w:pPr>
+      <w:r>
+        <w:t xml:space="preserve">It may be worth comparing </w:t>
+      </w:r>
+      <w:r>
+        <w:t xml:space="preserve">subject-level </w:t>
+      </w:r>
+      <w:r>
+        <w:t xml:space="preserve">spectra to clinical or behavioral scores </w:t>
+      </w:r>
+      <w:r>
+        <w:t>to</w:t>
+      </w:r>
+      <w:r>
+        <w:t xml:space="preserve"> determine whether any frequencies </w:t>
+      </w:r>
+      <w:r>
+        <w:t>show links to</w:t>
+      </w:r>
+      <w:r>
+        <w:t xml:space="preserve"> behavioral effects.</w:t>
+      </w:r>
+      <w:r>
+        <w:t xml:space="preserve">  If so, an examination of the affected modes could provide useful insights into connectivity biomarkers for such behaviors.</w:t>
+      </w:r>
+      <w:r>
+        <w:t xml:space="preserve">  This analysis may need to account for interaction effects.</w:t>
+      </w:r>
+    </w:p>
+    <w:p>
+      <w:pPr>
+        <w:pStyle w:val="MDPI31text"/>
+      </w:pPr>
+    </w:p>
+    <w:p>
+      <w:pPr>
+        <w:pStyle w:val="MDPI22heading2"/>
+      </w:pPr>
+      <w:r>
         <w:t>4</w:t>
       </w:r>
       <w:r>
-        <w:t xml:space="preserve">. </w:t>
-      </w:r>
-      <w:r>
-        <w:t>Large-Scale Modes and their Spectra</w:t>
-      </w:r>
-    </w:p>
-    <w:p>
-      <w:pPr>
-        <w:pStyle w:val="MDPI31text"/>
-      </w:pPr>
-      <w:r>
-        <w:t xml:space="preserve">It may be worth comparing </w:t>
-      </w:r>
-      <w:r>
-        <w:t xml:space="preserve">subject-level </w:t>
-      </w:r>
-      <w:r>
-        <w:t xml:space="preserve">spectra to clinical or behavioral scores </w:t>
-      </w:r>
-      <w:r>
-        <w:t>to</w:t>
-      </w:r>
-      <w:r>
-        <w:t xml:space="preserve"> determine whether any frequencies </w:t>
-      </w:r>
-      <w:r>
-        <w:t>show links to</w:t>
-      </w:r>
-      <w:r>
-        <w:t xml:space="preserve"> behavioral effects.</w:t>
-      </w:r>
-      <w:r>
-        <w:t xml:space="preserve">  If so, an examination of the affected modes could provide useful insights into connectivity biomarkers for such behaviors.</w:t>
-      </w:r>
-      <w:r>
-        <w:t xml:space="preserve">  This analysis may need to account for interaction effects.</w:t>
-      </w:r>
-    </w:p>
-    <w:p>
-      <w:pPr>
-        <w:pStyle w:val="MDPI31text"/>
-      </w:pPr>
-    </w:p>
-    <w:p>
-      <w:pPr>
-        <w:pStyle w:val="MDPI22heading2"/>
-      </w:pPr>
-      <w:r>
-        <w:t>4</w:t>
-      </w:r>
-      <w:r>
         <w:t>.</w:t>
       </w:r>
       <w:r>
-        <w:t>5</w:t>
+        <w:t>3</w:t>
       </w:r>
       <w:r>
         <w:t xml:space="preserve">. </w:t>
@@ -9137,6 +9394,7 @@
     <w:rsid w:val="0007797A"/>
     <w:rsid w:val="0015310E"/>
     <w:rsid w:val="002057E9"/>
+    <w:rsid w:val="002E020C"/>
     <w:rsid w:val="00437772"/>
     <w:rsid w:val="004B3681"/>
     <w:rsid w:val="005C0E87"/>
@@ -9149,6 +9407,7 @@
     <w:rsid w:val="00D31718"/>
     <w:rsid w:val="00E362C7"/>
     <w:rsid w:val="00EC2CDD"/>
+    <w:rsid w:val="00ED6B60"/>
   </w:rsids>
   <m:mathPr>
     <m:mathFont m:val="Cambria Math"/>

</xml_diff>